<commit_message>
finalised UML diagram and decisions,(tasks 1.3- 1.6)
</commit_message>
<xml_diff>
--- a/docs/SystemDesign.docx
+++ b/docs/SystemDesign.docx
@@ -69,17 +69,11 @@
           <w:bCs/>
         </w:rPr>
       </w:pPr>
-      <w:r>
-        <w:rPr>
-          <w:b/>
-          <w:bCs/>
-        </w:rPr>
-        <w:tab/>
-      </w:r>
     </w:p>
     <w:p>
       <w:pPr>
         <w:pStyle w:val="Heading2"/>
+        <w:jc w:val="both"/>
       </w:pPr>
       <w:r>
         <w:t>Design Decisions</w:t>
@@ -92,9 +86,22 @@
           <w:ilvl w:val="0"/>
           <w:numId w:val="1"/>
         </w:numPr>
-      </w:pPr>
-      <w:r>
-        <w:t>The “Card” class is an abstract base class that each suit can define a behaviour of its own using polymorphism through the play (Game&amp;, Player&amp;) function. This would keep all card specific logic separate from the “Game” class and make the design much cleaner and easier to add to.</w:t>
+        <w:jc w:val="both"/>
+      </w:pPr>
+      <w:r>
+        <w:t xml:space="preserve">The “Card” class is an abstract base class that each suit can define a behaviour of its own using polymorphism through the </w:t>
+      </w:r>
+      <w:r>
+        <w:t>“</w:t>
+      </w:r>
+      <w:r>
+        <w:t>play(Game&amp;, Player&amp;)</w:t>
+      </w:r>
+      <w:r>
+        <w:t>”</w:t>
+      </w:r>
+      <w:r>
+        <w:t xml:space="preserve"> function. This would keep all card specific logic separate from the “Game” class and make the design much cleaner and easier to add to.</w:t>
       </w:r>
     </w:p>
     <w:p>
@@ -104,9 +111,22 @@
           <w:ilvl w:val="0"/>
           <w:numId w:val="1"/>
         </w:numPr>
-      </w:pPr>
-      <w:r>
-        <w:t>Each of the card types such as Cannon, Chest, Key, Sword, Hook, Oracle, Map, Mermaid and Kraken is implement</w:t>
+        <w:jc w:val="both"/>
+      </w:pPr>
+      <w:r>
+        <w:t>Each of the card types such as Cannon, Chest, Key, Sword, Hook, Oracle, Map, Mermaid</w:t>
+      </w:r>
+      <w:r>
+        <w:t>,</w:t>
+      </w:r>
+      <w:r>
+        <w:t xml:space="preserve"> Kraken </w:t>
+      </w:r>
+      <w:r>
+        <w:t xml:space="preserve">and Anchor </w:t>
+      </w:r>
+      <w:r>
+        <w:t>is implement</w:t>
       </w:r>
       <w:r>
         <w:t>ed</w:t>
@@ -124,7 +144,16 @@
         <w:t xml:space="preserve">y </w:t>
       </w:r>
       <w:r>
-        <w:t xml:space="preserve">allows each one to handle itself independently which is required as each suit has a unique ability. </w:t>
+        <w:t xml:space="preserve">is necessary as each type </w:t>
+      </w:r>
+      <w:r>
+        <w:t>h</w:t>
+      </w:r>
+      <w:r>
+        <w:t>as a unique ability</w:t>
+      </w:r>
+      <w:r>
+        <w:t>.</w:t>
       </w:r>
     </w:p>
     <w:p>
@@ -134,9 +163,25 @@
           <w:ilvl w:val="0"/>
           <w:numId w:val="1"/>
         </w:numPr>
-      </w:pPr>
-      <w:r>
-        <w:t>The “Game” class is to manage the overall state of the game. It owns the deck, discard pile , list of players and turn flow as per the instructions.</w:t>
+        <w:jc w:val="both"/>
+      </w:pPr>
+      <w:r>
+        <w:t>The “Game” class is to manage the overall state of the game. It owns the deck, discard pile, list of players</w:t>
+      </w:r>
+      <w:r>
+        <w:t>, the</w:t>
+      </w:r>
+      <w:r>
+        <w:t xml:space="preserve"> turn</w:t>
+      </w:r>
+      <w:r>
+        <w:t>s, round number and the current player as</w:t>
+      </w:r>
+      <w:r>
+        <w:t xml:space="preserve"> per</w:t>
+      </w:r>
+      <w:r>
+        <w:t xml:space="preserve"> the instructions. </w:t>
       </w:r>
     </w:p>
     <w:p>
@@ -146,12 +191,25 @@
           <w:ilvl w:val="0"/>
           <w:numId w:val="1"/>
         </w:numPr>
-      </w:pPr>
-      <w:r>
-        <w:t>The “Player” class will manage its own bank and play area as the players are responsible for tracking their cards and to determine if the play area has gone to a bust.</w:t>
-      </w:r>
-      <w:r>
-        <w:t xml:space="preserve"> Also, because this game is strictly a 2 player game, this class associates with only 2 players.</w:t>
+        <w:jc w:val="both"/>
+      </w:pPr>
+      <w:r>
+        <w:t xml:space="preserve">The “Player” class will manage its own bank and play area as the players are responsible for tracking their cards </w:t>
+      </w:r>
+      <w:r>
+        <w:t xml:space="preserve">in the play area, seeing if </w:t>
+      </w:r>
+      <w:r>
+        <w:t xml:space="preserve">the play area has gone to </w:t>
+      </w:r>
+      <w:r>
+        <w:t>bust, moving cards into the bank, printing collections and knowing the score</w:t>
+      </w:r>
+      <w:r>
+        <w:t>.</w:t>
+      </w:r>
+      <w:r>
+        <w:t xml:space="preserve"> </w:t>
       </w:r>
     </w:p>
     <w:p>
@@ -161,7 +219,257 @@
           <w:ilvl w:val="0"/>
           <w:numId w:val="1"/>
         </w:numPr>
-      </w:pPr>
+        <w:jc w:val="both"/>
+      </w:pPr>
+      <w:r>
+        <w:t xml:space="preserve">The “Game” will also manage 2 </w:t>
+      </w:r>
+      <w:r>
+        <w:t>P</w:t>
+      </w:r>
+      <w:r>
+        <w:t>layer</w:t>
+      </w:r>
+      <w:r>
+        <w:t xml:space="preserve"> objects </w:t>
+      </w:r>
+      <w:r>
+        <w:t xml:space="preserve">as this game is a </w:t>
+      </w:r>
+      <w:r>
+        <w:t>2-player</w:t>
+      </w:r>
+      <w:r>
+        <w:t xml:space="preserve"> game. </w:t>
+      </w:r>
+    </w:p>
+    <w:p>
+      <w:pPr>
+        <w:pStyle w:val="ListParagraph"/>
+        <w:numPr>
+          <w:ilvl w:val="0"/>
+          <w:numId w:val="1"/>
+        </w:numPr>
+        <w:jc w:val="both"/>
+      </w:pPr>
+      <w:r>
+        <w:t xml:space="preserve">The “Game” </w:t>
+      </w:r>
+      <w:r>
+        <w:t xml:space="preserve">also will store </w:t>
+      </w:r>
+      <w:r>
+        <w:t xml:space="preserve">the discard pile as </w:t>
+      </w:r>
+      <w:r>
+        <w:t>m</w:t>
+      </w:r>
+      <w:r>
+        <w:t>any card abilities interact with it such as Map</w:t>
+      </w:r>
+      <w:r>
+        <w:t>, Chest and Key.</w:t>
+      </w:r>
+      <w:r>
+        <w:t xml:space="preserve"> </w:t>
+      </w:r>
+    </w:p>
+    <w:p>
+      <w:pPr>
+        <w:pStyle w:val="ListParagraph"/>
+        <w:numPr>
+          <w:ilvl w:val="0"/>
+          <w:numId w:val="1"/>
+        </w:numPr>
+        <w:jc w:val="both"/>
+      </w:pPr>
+      <w:r>
+        <w:t xml:space="preserve">As per the instructions, the </w:t>
+      </w:r>
+      <w:r>
+        <w:t>“</w:t>
+      </w:r>
+      <w:r>
+        <w:t>willAddToBank(Game&amp;, Player&amp;)</w:t>
+      </w:r>
+      <w:r>
+        <w:t>”</w:t>
+      </w:r>
+      <w:r>
+        <w:t xml:space="preserve"> function is within the Card class as </w:t>
+      </w:r>
+      <w:r>
+        <w:t>the Chest and Key only triggers their effects when the cards are banked</w:t>
+      </w:r>
+      <w:r>
+        <w:t>.</w:t>
+      </w:r>
+    </w:p>
+    <w:p>
+      <w:pPr>
+        <w:pStyle w:val="ListParagraph"/>
+        <w:numPr>
+          <w:ilvl w:val="0"/>
+          <w:numId w:val="1"/>
+        </w:numPr>
+        <w:jc w:val="both"/>
+      </w:pPr>
+      <w:r>
+        <w:t xml:space="preserve">All the card collections (deck, bank, play area and discard pile) are setup using the “std::vector&lt;Card*&gt;” as the instructions </w:t>
+      </w:r>
+      <w:r>
+        <w:t xml:space="preserve">mention </w:t>
+      </w:r>
+      <w:r>
+        <w:t>to use standard library containers with dynamically allocated objects.</w:t>
+      </w:r>
+    </w:p>
+    <w:p>
+      <w:pPr>
+        <w:pStyle w:val="ListParagraph"/>
+        <w:numPr>
+          <w:ilvl w:val="0"/>
+          <w:numId w:val="1"/>
+        </w:numPr>
+        <w:jc w:val="both"/>
+      </w:pPr>
+      <w:r>
+        <w:t xml:space="preserve">The relationships between classes are kept at a minimum so each class would interact with another only when necessary. </w:t>
+      </w:r>
+    </w:p>
+    <w:p>
+      <w:pPr>
+        <w:pStyle w:val="ListParagraph"/>
+        <w:numPr>
+          <w:ilvl w:val="0"/>
+          <w:numId w:val="1"/>
+        </w:numPr>
+        <w:jc w:val="both"/>
+      </w:pPr>
+      <w:r>
+        <w:t>The AnchorCard is within it</w:t>
+      </w:r>
+      <w:r>
+        <w:t>s</w:t>
+      </w:r>
+      <w:r>
+        <w:t xml:space="preserve"> own subclass and the special “safe cards before Anchor” behaviour is </w:t>
+      </w:r>
+      <w:r>
+        <w:t xml:space="preserve">in </w:t>
+      </w:r>
+      <w:r>
+        <w:t xml:space="preserve">the Anchor Card </w:t>
+      </w:r>
+      <w:r>
+        <w:t xml:space="preserve">class </w:t>
+      </w:r>
+      <w:r>
+        <w:t xml:space="preserve">instead of being </w:t>
+      </w:r>
+      <w:r>
+        <w:t xml:space="preserve">in the </w:t>
+      </w:r>
+      <w:r>
+        <w:t>Game class.</w:t>
+      </w:r>
+    </w:p>
+    <w:p>
+      <w:r>
+        <w:br w:type="page"/>
+      </w:r>
+    </w:p>
+    <w:p>
+      <w:pPr>
+        <w:jc w:val="both"/>
+      </w:pPr>
+      <w:r>
+        <w:lastRenderedPageBreak/>
+        <w:t>UML Diagram –</w:t>
+      </w:r>
+    </w:p>
+    <w:p>
+      <w:pPr>
+        <w:jc w:val="both"/>
+      </w:pPr>
+      <w:hyperlink r:id="rId6" w:history="1">
+        <w:r>
+          <w:rPr>
+            <w:rStyle w:val="Hyperlink"/>
+          </w:rPr>
+          <w:t>https://lucid.app/lucidchart/f65f38e3-e54c-46ae-a5d3-8f08504524</w:t>
+        </w:r>
+        <w:r>
+          <w:rPr>
+            <w:rStyle w:val="Hyperlink"/>
+          </w:rPr>
+          <w:t>f</w:t>
+        </w:r>
+        <w:r>
+          <w:rPr>
+            <w:rStyle w:val="Hyperlink"/>
+          </w:rPr>
+          <w:t>7/edit?viewport_loc=2082%2C-2505%2C5109%2C2540%2C0_0&amp;invitationId=inv_fe77a590-215c-4db4-ba71-e18aece2fae3</w:t>
+        </w:r>
+      </w:hyperlink>
+    </w:p>
+    <w:p>
+      <w:pPr>
+        <w:jc w:val="both"/>
+      </w:pPr>
+      <w:r>
+        <w:rPr>
+          <w:noProof/>
+        </w:rPr>
+        <w:drawing>
+          <wp:inline distT="0" distB="0" distL="0" distR="0" wp14:anchorId="45B8CBB1" wp14:editId="7CBBF7F0">
+            <wp:extent cx="5926455" cy="3124200"/>
+            <wp:effectExtent l="0" t="0" r="0" b="0"/>
+            <wp:docPr id="1135381023" name="Picture 1"/>
+            <wp:cNvGraphicFramePr>
+              <a:graphicFrameLocks xmlns:a="http://schemas.openxmlformats.org/drawingml/2006/main" noChangeAspect="1"/>
+            </wp:cNvGraphicFramePr>
+            <a:graphic xmlns:a="http://schemas.openxmlformats.org/drawingml/2006/main">
+              <a:graphicData uri="http://schemas.openxmlformats.org/drawingml/2006/picture">
+                <pic:pic xmlns:pic="http://schemas.openxmlformats.org/drawingml/2006/picture">
+                  <pic:nvPicPr>
+                    <pic:cNvPr id="0" name="Picture 3"/>
+                    <pic:cNvPicPr>
+                      <a:picLocks noChangeAspect="1" noChangeArrowheads="1"/>
+                    </pic:cNvPicPr>
+                  </pic:nvPicPr>
+                  <pic:blipFill>
+                    <a:blip r:embed="rId7" cstate="print">
+                      <a:extLst>
+                        <a:ext uri="{28A0092B-C50C-407E-A947-70E740481C1C}">
+                          <a14:useLocalDpi xmlns:a14="http://schemas.microsoft.com/office/drawing/2010/main" val="0"/>
+                        </a:ext>
+                      </a:extLst>
+                    </a:blip>
+                    <a:srcRect/>
+                    <a:stretch>
+                      <a:fillRect/>
+                    </a:stretch>
+                  </pic:blipFill>
+                  <pic:spPr bwMode="auto">
+                    <a:xfrm>
+                      <a:off x="0" y="0"/>
+                      <a:ext cx="5926455" cy="3124200"/>
+                    </a:xfrm>
+                    <a:prstGeom prst="rect">
+                      <a:avLst/>
+                    </a:prstGeom>
+                    <a:noFill/>
+                    <a:ln>
+                      <a:noFill/>
+                    </a:ln>
+                  </pic:spPr>
+                </pic:pic>
+              </a:graphicData>
+            </a:graphic>
+          </wp:inline>
+        </w:drawing>
+      </w:r>
     </w:p>
     <w:sectPr>
       <w:pgSz w:w="12240" w:h="15840"/>
@@ -1205,6 +1513,18 @@
       <w:shd w:val="clear" w:color="auto" w:fill="E1DFDD"/>
     </w:rPr>
   </w:style>
+  <w:style w:type="character" w:styleId="FollowedHyperlink">
+    <w:name w:val="FollowedHyperlink"/>
+    <w:basedOn w:val="DefaultParagraphFont"/>
+    <w:uiPriority w:val="99"/>
+    <w:semiHidden/>
+    <w:unhideWhenUsed/>
+    <w:rsid w:val="004E7673"/>
+    <w:rPr>
+      <w:color w:val="96607D" w:themeColor="followedHyperlink"/>
+      <w:u w:val="single"/>
+    </w:rPr>
+  </w:style>
 </w:styles>
 </file>
 

</xml_diff>